<commit_message>
docs: add teacher-focused pitch and clarify AI privacy wording
Add pitch_plain (md, html, docx, pdf), a benefits-led version of the
pitch for classroom teachers. Reword the pitch's privacy statement:
no names, emails or profile data are sent, but core_ai providers may
receive a hashed pseudonymous user ID.
</commit_message>
<xml_diff>
--- a/docs/pitch.docx
+++ b/docs/pitch.docx
@@ -12,7 +12,7 @@
     </w:p>
     <w:p>
       <w:r>
-        <w:t xml:space="preserve">Any reference to AI/LLM systems in this document covers external "bring your own inference" access. It is possible to use subscription cloud-based inference or in-house self-hosting. Nothing that would personally identify a student is sent to an external LLM for any setup permutation.</w:t>
+        <w:t xml:space="preserve">Any reference to AI/LLM systems in this document covers external "bring your own inference" access. It is possible to use subscription cloud-based inference or in-house self-hosting. No names, emails or profile data are sent to an external LLM in any setup. When AI blurbs use Moodle’s AI subsystem, the provider may receive a hashed pseudonymous user ID.</w:t>
       </w:r>
     </w:p>
     <w:p>
@@ -56,7 +56,7 @@
       <w:r>
         <w:drawing>
           <wp:inline distT="0" distB="0" distL="0" distR="0">
-            <wp:extent cx="3686175" cy="4762500"/>
+            <wp:extent cx="3317557" cy="4286250"/>
             <wp:effectExtent t="0" r="0" b="0" l="0"/>
             <wp:docPr id="1" name="my_placement.png" descr="Course recommender block on the /my page" title="Course recommender block on the /my page"/>
             <wp:cNvGraphicFramePr>
@@ -81,7 +81,7 @@
                   <pic:spPr bwMode="auto">
                     <a:xfrm>
                       <a:off x="0" y="0"/>
-                      <a:ext cx="3686175" cy="4762500"/>
+                      <a:ext cx="3317557" cy="4286250"/>
                     </a:xfrm>
                     <a:prstGeom prst="rect">
                       <a:avLst/>

</xml_diff>